<commit_message>
Report polish: precise effort wording + auditable verified-bucket table
- Student checklist: "(an afternoon, once per manuscript)" replaced with the
  precise claim — once per manuscript, before submission; by hand a few
  focused hours, minutes with the companion AI file. (Vague duration read
  as filler.)
- Report spec (skill + portable, in sync): the verified bucket expands on
  request — and by default in the milestone HTML one-pager — into a
  per-item fields-matched table with a passed-with-note status for benign
  discrepancies (e.g. online-first vs version-of-record year, rule 4),
  making the ✓ bucket auditable without cluttering the action-first fix
  list. Pass-table idea credited to helloxAI/check-cite; CiteCheck's
  per-reference status table converges.

Co-Authored-By: Claude Fable 5 <noreply@anthropic.com>
</commit_message>
<xml_diff>
--- a/standalone/citation-integrity/citation-checklist-for-students.docx
+++ b/standalone/citation-integrity/citation-checklist-for-students.docx
@@ -315,13 +315,25 @@
       </w:r>
     </w:p>
     <w:bookmarkEnd w:id="10"/>
-    <w:bookmarkStart w:id="11" w:name="X09f564e823d875ab369ef730170f38f61608cef"/>
+    <w:bookmarkStart w:id="11" w:name="X28b93882025eaf982edc4289369631c81ffe066"/>
     <w:p>
       <w:pPr>
         <w:pStyle w:val="Heading2"/>
       </w:pPr>
       <w:r>
-        <w:t xml:space="preserve">The pre-submission checks (an afternoon, once per manuscript)</w:t>
+        <w:t xml:space="preserve">The pre-submission checks (once per manuscript, before you submit)</w:t>
+      </w:r>
+    </w:p>
+    <w:p>
+      <w:pPr>
+        <w:pStyle w:val="FirstParagraph"/>
+      </w:pPr>
+      <w:r>
+        <w:rPr>
+          <w:i/>
+          <w:iCs/>
+        </w:rPr>
+        <w:t xml:space="preserve">By hand, these take a few focused hours for a typical reference list; the companion AI file at the end reduces the mechanical ones to minutes.</w:t>
       </w:r>
     </w:p>
     <w:p>

</xml_diff>